<commit_message>
Refresh resume with portfolio, live project links and verified engineering experience
</commit_message>
<xml_diff>
--- a/assets/Chaitanyachidambar_S_Kulkarni_Resume.docx
+++ b/assets/Chaitanyachidambar_S_Kulkarni_Resume.docx
@@ -5,14 +5,15 @@
     <w:p>
       <w:pPr>
         <w:pStyle w:val="Title"/>
+        <w:spacing w:after="0"/>
       </w:pPr>
       <w:r>
+        <w:rPr/>
         <w:t>CHAITANYACHIDAMBAR S KULKARNI</w:t>
       </w:r>
     </w:p>
     <w:p>
       <w:pPr>
-        <w:widowControl/>
         <w:spacing w:after="80"/>
       </w:pPr>
       <w:r>
@@ -25,21 +26,20 @@
     </w:p>
     <w:p>
       <w:pPr>
-        <w:widowControl/>
         <w:spacing w:after="40"/>
       </w:pPr>
       <w:r>
         <w:rPr>
-          <w:b w:val="0"/>
           <w:sz w:val="21"/>
         </w:rPr>
         <w:t xml:space="preserve">Bengaluru, Karnataka | +91 9591454650 | </w:t>
       </w:r>
-      <w:hyperlink r:id="rId9">
+      <w:hyperlink r:id="rId9" w:history="1">
         <w:r>
           <w:rPr>
             <w:color w:val="000000"/>
             <w:u w:val="single"/>
+            <w:sz w:val="21"/>
           </w:rPr>
           <w:t>chaitanyarocks.kulkarni@gmail.com</w:t>
         </w:r>
@@ -47,20 +47,19 @@
     </w:p>
     <w:p>
       <w:pPr>
-        <w:widowControl/>
         <w:spacing w:after="40"/>
       </w:pPr>
       <w:r>
         <w:rPr>
-          <w:b w:val="0"/>
           <w:sz w:val="21"/>
         </w:rPr>
       </w:r>
-      <w:hyperlink r:id="rId10">
+      <w:hyperlink r:id="rId10" w:history="1">
         <w:r>
           <w:rPr>
             <w:color w:val="000000"/>
             <w:u w:val="single"/>
+            <w:sz w:val="21"/>
           </w:rPr>
           <w:t>linkedin.com/in/chaitanyachidambarkulkarni</w:t>
         </w:r>
@@ -68,11 +67,12 @@
       <w:r>
         <w:t xml:space="preserve"> | </w:t>
       </w:r>
-      <w:hyperlink r:id="rId11">
+      <w:hyperlink r:id="rId11" w:history="1">
         <w:r>
           <w:rPr>
             <w:color w:val="000000"/>
             <w:u w:val="single"/>
+            <w:sz w:val="21"/>
           </w:rPr>
           <w:t>github.com/chaitanyalogin</w:t>
         </w:r>
@@ -80,54 +80,66 @@
     </w:p>
     <w:p>
       <w:pPr>
-        <w:widowControl/>
-        <w:spacing w:after="60"/>
+        <w:spacing w:after="40"/>
       </w:pPr>
       <w:r>
         <w:rPr>
-          <w:b w:val="0"/>
           <w:sz w:val="21"/>
         </w:rPr>
-        <w:t>Available immediately | Bengaluru or remote</w:t>
+        <w:t xml:space="preserve">Portfolio: </w:t>
+      </w:r>
+      <w:hyperlink r:id="rId12" w:history="1">
+        <w:r>
+          <w:rPr>
+            <w:color w:val="000000"/>
+            <w:u w:val="single"/>
+            <w:sz w:val="21"/>
+          </w:rPr>
+          <w:t>chaitanya-portfolio-a2f.pages.dev</w:t>
+        </w:r>
+      </w:hyperlink>
+      <w:r>
+        <w:rPr>
+          <w:sz w:val="21"/>
+        </w:rPr>
+        <w:t xml:space="preserve"> | Available immediately</w:t>
       </w:r>
     </w:p>
     <w:p>
       <w:pPr>
         <w:pStyle w:val="Heading1"/>
+        <w:spacing w:after="40"/>
       </w:pPr>
       <w:r>
+        <w:rPr/>
         <w:t>PROFESSIONAL SUMMARY</w:t>
       </w:r>
     </w:p>
     <w:p>
       <w:pPr>
-        <w:widowControl/>
-        <w:spacing w:after="60"/>
+        <w:spacing w:after="40"/>
       </w:pPr>
       <w:r>
-        <w:rPr>
-          <w:b w:val="0"/>
-        </w:rPr>
-        <w:t>Full stack developer with MERN internship experience and a deployed SaaS verification project. Builds React interfaces, Node.js APIs and database workflows using TypeScript, PostgreSQL and Redis. Additional experience in Python automation, SQL reporting and automated testing.</w:t>
+        <w:rPr/>
+        <w:t>Full stack developer with MERN internship experience and a deployed TypeScript SaaS application. Builds React interfaces, Node.js APIs and PostgreSQL/Redis workflows with automated testing, CI/CD and Python automation.</w:t>
       </w:r>
     </w:p>
     <w:p>
       <w:pPr>
         <w:pStyle w:val="Heading1"/>
+        <w:spacing w:after="40"/>
       </w:pPr>
       <w:r>
+        <w:rPr/>
         <w:t>TECHNICAL SKILLS</w:t>
       </w:r>
     </w:p>
     <w:p>
       <w:pPr>
-        <w:widowControl/>
         <w:spacing w:after="40"/>
       </w:pPr>
       <w:r>
-        <w:rPr>
-          <w:b w:val="0"/>
-        </w:rPr>
+        <w:rPr/>
       </w:r>
       <w:r>
         <w:rPr>
@@ -141,13 +153,10 @@
     </w:p>
     <w:p>
       <w:pPr>
-        <w:widowControl/>
         <w:spacing w:after="40"/>
       </w:pPr>
       <w:r>
-        <w:rPr>
-          <w:b w:val="0"/>
-        </w:rPr>
+        <w:rPr/>
       </w:r>
       <w:r>
         <w:rPr>
@@ -156,18 +165,15 @@
         <w:t xml:space="preserve">Frontend: </w:t>
       </w:r>
       <w:r>
-        <w:t>React.js, HTML5, CSS3, Tailwind CSS, Bootstrap, Redux, Context API, Vite</w:t>
+        <w:t>React.js, Next.js, HTML5, CSS3, Tailwind CSS, Redux, Context API, Vite</w:t>
       </w:r>
     </w:p>
     <w:p>
       <w:pPr>
-        <w:widowControl/>
         <w:spacing w:after="40"/>
       </w:pPr>
       <w:r>
-        <w:rPr>
-          <w:b w:val="0"/>
-        </w:rPr>
+        <w:rPr/>
       </w:r>
       <w:r>
         <w:rPr>
@@ -181,13 +187,10 @@
     </w:p>
     <w:p>
       <w:pPr>
-        <w:widowControl/>
         <w:spacing w:after="40"/>
       </w:pPr>
       <w:r>
-        <w:rPr>
-          <w:b w:val="0"/>
-        </w:rPr>
+        <w:rPr/>
       </w:r>
       <w:r>
         <w:rPr>
@@ -196,25 +199,26 @@
         <w:t xml:space="preserve">Tools and testing: </w:t>
       </w:r>
       <w:r>
-        <w:t>Git, GitHub Actions, Docker, Playwright, Vitest, Postman, Power BI, Pandas, FFmpeg</w:t>
+        <w:t>Git, GitHub Actions, Docker, Playwright, Vitest, Postman, Power BI, Excel</w:t>
       </w:r>
     </w:p>
     <w:p>
       <w:pPr>
         <w:pStyle w:val="Heading1"/>
+        <w:spacing w:after="40"/>
       </w:pPr>
       <w:r>
+        <w:rPr/>
         <w:t>SELECTED PROJECTS</w:t>
       </w:r>
     </w:p>
     <w:p>
       <w:pPr>
         <w:keepNext/>
-        <w:widowControl/>
         <w:tabs>
           <w:tab w:pos="10368" w:val="right"/>
         </w:tabs>
-        <w:spacing w:after="60"/>
+        <w:spacing w:after="40"/>
       </w:pPr>
       <w:r>
         <w:rPr>
@@ -223,41 +227,23 @@
         <w:t>EntitlementCI | SaaS Entitlement Verification</w:t>
       </w:r>
       <w:r>
-        <w:rPr>
-          <w:b w:val="0"/>
-        </w:rPr>
         <w:tab/>
         <w:t>Sep 2026 to Present</w:t>
       </w:r>
     </w:p>
     <w:p>
       <w:pPr>
-        <w:widowControl/>
         <w:spacing w:after="60"/>
       </w:pPr>
       <w:r>
-        <w:rPr>
-          <w:b w:val="0"/>
-          <w:sz w:val="21"/>
-        </w:rPr>
+        <w:rPr/>
       </w:r>
-      <w:hyperlink r:id="rId12">
+      <w:hyperlink r:id="rId13" w:history="1">
         <w:r>
           <w:rPr>
             <w:color w:val="000000"/>
             <w:u w:val="single"/>
-          </w:rPr>
-          <w:t>Source code</w:t>
-        </w:r>
-      </w:hyperlink>
-      <w:r>
-        <w:t xml:space="preserve"> | </w:t>
-      </w:r>
-      <w:hyperlink r:id="rId13">
-        <w:r>
-          <w:rPr>
-            <w:color w:val="000000"/>
-            <w:u w:val="single"/>
+            <w:sz w:val="21"/>
           </w:rPr>
           <w:t>Live application</w:t>
         </w:r>
@@ -265,111 +251,106 @@
       <w:r>
         <w:t xml:space="preserve"> | </w:t>
       </w:r>
-      <w:hyperlink r:id="rId14">
+      <w:hyperlink r:id="rId14" w:history="1">
         <w:r>
           <w:rPr>
             <w:color w:val="000000"/>
             <w:u w:val="single"/>
+            <w:sz w:val="21"/>
           </w:rPr>
-          <w:t>Reviewer demo</w:t>
+          <w:t>Source code</w:t>
         </w:r>
       </w:hyperlink>
     </w:p>
     <w:p>
       <w:pPr>
+        <w:keepLines/>
         <w:widowControl/>
-        <w:spacing w:after="60"/>
+        <w:spacing w:after="40"/>
         <w:ind w:left="173" w:hanging="173"/>
       </w:pPr>
       <w:r>
-        <w:rPr>
-          <w:b w:val="0"/>
-        </w:rPr>
-      </w:r>
-      <w:r>
-        <w:t xml:space="preserve">• </w:t>
-      </w:r>
-      <w:r>
-        <w:t>Built a React and Fastify application that detects mismatches between subscription entitlements and actual access, including denied Enterprise features and incorrect API limits.</w:t>
+        <w:rPr/>
+        <w:t>• Built a React and Fastify platform with Prisma to detect subscription access mismatches and manage incident lifecycles.</w:t>
       </w:r>
     </w:p>
     <w:p>
       <w:pPr>
+        <w:keepLines/>
         <w:widowControl/>
-        <w:spacing w:after="60"/>
+        <w:spacing w:after="40"/>
         <w:ind w:left="173" w:hanging="173"/>
       </w:pPr>
       <w:r>
-        <w:rPr>
-          <w:b w:val="0"/>
-        </w:rPr>
-      </w:r>
-      <w:r>
-        <w:t xml:space="preserve">• </w:t>
-      </w:r>
-      <w:r>
-        <w:t>Created a TypeScript Node SDK to report access decisions and usage; processed observations through Redis and BullMQ to open, group and resolve incidents.</w:t>
+        <w:rPr/>
+        <w:t>• Developed a TypeScript Node SDK and Redis/BullMQ pipeline with PostgreSQL transactions, idempotent processing and stale event handling.</w:t>
       </w:r>
     </w:p>
     <w:p>
       <w:pPr>
+        <w:keepLines/>
         <w:widowControl/>
-        <w:spacing w:after="60"/>
+        <w:spacing w:after="40"/>
         <w:ind w:left="173" w:hanging="173"/>
       </w:pPr>
       <w:r>
-        <w:rPr>
-          <w:b w:val="0"/>
-        </w:rPr>
-      </w:r>
-      <w:r>
-        <w:t xml:space="preserve">• </w:t>
-      </w:r>
-      <w:r>
-        <w:t>Implemented transactional PostgreSQL updates, duplicate processing checks and stale event handling; added tenant isolation, role based access controls and signed webhook verification.</w:t>
+        <w:rPr/>
+        <w:t>• Enforced tenant isolation, role based access and signed webhook verification; deployed the API, dashboard and worker on Northflank with Supabase PostgreSQL.</w:t>
       </w:r>
     </w:p>
     <w:p>
       <w:pPr>
+        <w:keepLines/>
         <w:widowControl/>
-        <w:spacing w:after="60"/>
+        <w:spacing w:after="40"/>
         <w:ind w:left="173" w:hanging="173"/>
       </w:pPr>
       <w:r>
-        <w:rPr>
-          <w:b w:val="0"/>
-        </w:rPr>
-      </w:r>
-      <w:r>
-        <w:t xml:space="preserve">• </w:t>
-      </w:r>
-      <w:r>
-        <w:t>Deployed API, dashboard, worker, PostgreSQL and Redis on Railway; used Docker Compose for local startup.</w:t>
-      </w:r>
-    </w:p>
-    <w:p>
-      <w:pPr>
-        <w:widowControl/>
-        <w:spacing w:after="60"/>
-        <w:ind w:left="173" w:hanging="173"/>
-      </w:pPr>
-      <w:r>
-        <w:rPr>
-          <w:b w:val="0"/>
-        </w:rPr>
-      </w:r>
-      <w:r>
-        <w:t xml:space="preserve">• </w:t>
-      </w:r>
-      <w:r>
-        <w:t>Configured GitHub Actions CI with build, lint and type checks; recorded passing results for 7 unit/security tests, 18 integration checks and 1 Playwright browser flow.</w:t>
+        <w:rPr/>
+        <w:t>• Configured GitHub Actions CI and Playwright tests; passed 12 live integration checks covering incident detection, regression, secure sessions and organization isolation.</w:t>
       </w:r>
     </w:p>
     <w:p>
       <w:pPr>
         <w:keepNext/>
+        <w:spacing w:after="40"/>
+      </w:pPr>
+      <w:r>
+        <w:rPr>
+          <w:b/>
+        </w:rPr>
+        <w:t>Developer Portfolio | Next.js and WebGL2</w:t>
+      </w:r>
+      <w:r>
+        <w:t xml:space="preserve"> | </w:t>
+      </w:r>
+      <w:hyperlink r:id="rId12" w:history="1">
+        <w:r>
+          <w:rPr>
+            <w:color w:val="000000"/>
+            <w:u w:val="single"/>
+            <w:sz w:val="21"/>
+          </w:rPr>
+          <w:t>Live site</w:t>
+        </w:r>
+      </w:hyperlink>
+    </w:p>
+    <w:p>
+      <w:pPr>
+        <w:keepLines/>
         <w:widowControl/>
-        <w:spacing w:after="60"/>
+        <w:spacing w:after="40"/>
+        <w:ind w:left="173" w:hanging="173"/>
+      </w:pPr>
+      <w:r>
+        <w:rPr/>
+        <w:t>• Built a statically exported Next.js site with WebGL2 visuals, responsive layouts, motion controls and resume downloads; deployed on Cloudflare Pages.</w:t>
+      </w:r>
+    </w:p>
+    <w:p>
+      <w:pPr>
+        <w:keepNext/>
+        <w:spacing w:after="40"/>
       </w:pPr>
       <w:r>
         <w:rPr>
@@ -380,38 +361,33 @@
     </w:p>
     <w:p>
       <w:pPr>
+        <w:keepLines/>
         <w:widowControl/>
-        <w:spacing w:after="60"/>
+        <w:spacing w:after="40"/>
         <w:ind w:left="173" w:hanging="173"/>
       </w:pPr>
       <w:r>
-        <w:rPr>
-          <w:b w:val="0"/>
-        </w:rPr>
-      </w:r>
-      <w:r>
-        <w:t xml:space="preserve">• </w:t>
-      </w:r>
-      <w:r>
-        <w:t>Built a modular, JSON configured workflow for video rendering, audio mastering and subtitle synchronization; integrated forced alignment and semantic image matching on Kaggle GPU infrastructure.</w:t>
+        <w:rPr/>
+        <w:t>• Built a JSON configured Python/FFmpeg pipeline for video rendering, audio mastering and forced alignment of subtitles on Kaggle GPU infrastructure.</w:t>
       </w:r>
     </w:p>
     <w:p>
       <w:pPr>
         <w:pStyle w:val="Heading1"/>
+        <w:spacing w:after="40"/>
       </w:pPr>
       <w:r>
+        <w:rPr/>
         <w:t>PROFESSIONAL EXPERIENCE</w:t>
       </w:r>
     </w:p>
     <w:p>
       <w:pPr>
         <w:keepNext/>
-        <w:widowControl/>
         <w:tabs>
           <w:tab w:pos="10368" w:val="right"/>
         </w:tabs>
-        <w:spacing w:after="60"/>
+        <w:spacing w:after="40"/>
       </w:pPr>
       <w:r>
         <w:rPr>
@@ -420,57 +396,41 @@
         <w:t>Software Engineer Intern | HAEGL Technologies, Hubli</w:t>
       </w:r>
       <w:r>
-        <w:rPr>
-          <w:b w:val="0"/>
-        </w:rPr>
         <w:tab/>
         <w:t>Sep 2025 to Jul 2026</w:t>
       </w:r>
     </w:p>
     <w:p>
       <w:pPr>
+        <w:keepLines/>
         <w:widowControl/>
-        <w:spacing w:after="60"/>
+        <w:spacing w:after="40"/>
         <w:ind w:left="173" w:hanging="173"/>
       </w:pPr>
       <w:r>
-        <w:rPr>
-          <w:b w:val="0"/>
-        </w:rPr>
-      </w:r>
-      <w:r>
-        <w:t xml:space="preserve">• </w:t>
-      </w:r>
-      <w:r>
-        <w:t>Developed responsive React components and MERN application features; integrated REST APIs, authentication and error handling with Redux and Context API state management.</w:t>
+        <w:rPr/>
+        <w:t>• Developed React interfaces and MERN features with REST API integration, authentication, error handling and Redux/Context API state management.</w:t>
       </w:r>
     </w:p>
     <w:p>
       <w:pPr>
+        <w:keepLines/>
         <w:widowControl/>
-        <w:spacing w:after="60"/>
+        <w:spacing w:after="40"/>
         <w:ind w:left="173" w:hanging="173"/>
       </w:pPr>
       <w:r>
-        <w:rPr>
-          <w:b w:val="0"/>
-        </w:rPr>
-      </w:r>
-      <w:r>
-        <w:t xml:space="preserve">• </w:t>
-      </w:r>
-      <w:r>
-        <w:t>Built reusable interfaces with Tailwind CSS and Bootstrap; debugged frontend and backend integration and validated API responses using Postman.</w:t>
+        <w:rPr/>
+        <w:t>• Built reusable Tailwind CSS and Bootstrap components; debugged frontend/backend integration and validated API responses with Postman.</w:t>
       </w:r>
     </w:p>
     <w:p>
       <w:pPr>
         <w:keepNext/>
-        <w:widowControl/>
         <w:tabs>
           <w:tab w:pos="10368" w:val="right"/>
         </w:tabs>
-        <w:spacing w:after="60"/>
+        <w:spacing w:after="40"/>
       </w:pPr>
       <w:r>
         <w:rPr>
@@ -479,47 +439,70 @@
         <w:t>Junior Software Engineer | iTriangle Infotech, Bengaluru</w:t>
       </w:r>
       <w:r>
-        <w:rPr>
-          <w:b w:val="0"/>
-        </w:rPr>
         <w:tab/>
         <w:t>Jun 2025 to Jul 2025</w:t>
       </w:r>
     </w:p>
     <w:p>
       <w:pPr>
+        <w:keepLines/>
         <w:widowControl/>
-        <w:spacing w:after="60"/>
+        <w:spacing w:after="40"/>
         <w:ind w:left="173" w:hanging="173"/>
       </w:pPr>
       <w:r>
+        <w:rPr/>
+        <w:t>• Built Power BI dashboards for end of line testing and MIS using MySQL, Python/Pandas and DAX; validated data and investigated reporting discrepancies.</w:t>
+      </w:r>
+    </w:p>
+    <w:p>
+      <w:pPr>
+        <w:keepNext/>
+        <w:tabs>
+          <w:tab w:pos="10368" w:val="right"/>
+        </w:tabs>
+        <w:spacing w:after="40"/>
+      </w:pPr>
+      <w:r>
         <w:rPr>
-          <w:b w:val="0"/>
+          <w:b/>
         </w:rPr>
+        <w:t>Data Analyst Intern | AI Variant</w:t>
       </w:r>
       <w:r>
-        <w:t xml:space="preserve">• </w:t>
+        <w:tab/>
+        <w:t>Nov 2023 to May 2024</w:t>
       </w:r>
+    </w:p>
+    <w:p>
+      <w:pPr>
+        <w:keepLines/>
+        <w:widowControl/>
+        <w:spacing w:after="40"/>
+        <w:ind w:left="173" w:hanging="173"/>
+      </w:pPr>
       <w:r>
-        <w:t>Built Power BI dashboards for end of line testing, MIS and operational reporting using MySQL, Python/Pandas and DAX; validated source data and investigated reporting discrepancies.</w:t>
+        <w:rPr/>
+        <w:t>• Used SQL, Excel, Power BI and Tableau for data preparation, analysis and dashboard reporting.</w:t>
       </w:r>
     </w:p>
     <w:p>
       <w:pPr>
         <w:pStyle w:val="Heading1"/>
+        <w:spacing w:after="40"/>
       </w:pPr>
       <w:r>
+        <w:rPr/>
         <w:t>EDUCATION AND CERTIFICATIONS</w:t>
       </w:r>
     </w:p>
     <w:p>
       <w:pPr>
         <w:keepNext/>
-        <w:widowControl/>
         <w:tabs>
           <w:tab w:pos="10368" w:val="right"/>
         </w:tabs>
-        <w:spacing w:after="60"/>
+        <w:spacing w:after="40"/>
       </w:pPr>
       <w:r>
         <w:rPr>
@@ -528,34 +511,25 @@
         <w:t>Master of Computer Applications | Full Stack Development</w:t>
       </w:r>
       <w:r>
-        <w:rPr>
-          <w:b w:val="0"/>
-        </w:rPr>
         <w:tab/>
-        <w:t>Pursuing</w:t>
+        <w:t>In progress</w:t>
       </w:r>
     </w:p>
     <w:p>
       <w:pPr>
-        <w:widowControl/>
-        <w:spacing w:after="60"/>
+        <w:spacing w:after="40"/>
       </w:pPr>
       <w:r>
-        <w:rPr>
-          <w:b w:val="0"/>
-        </w:rPr>
-        <w:t>Jain University | Online program</w:t>
+        <w:rPr/>
+        <w:t>Jain University | Online program; Semesters I and II completed</w:t>
       </w:r>
     </w:p>
     <w:p>
       <w:pPr>
-        <w:widowControl/>
         <w:spacing w:after="0"/>
       </w:pPr>
       <w:r>
-        <w:rPr>
-          <w:b w:val="0"/>
-        </w:rPr>
+        <w:rPr/>
         <w:t>ExcelR certifications: Data Analytics, Data Science and Core Python Programming</w:t>
       </w:r>
     </w:p>
@@ -996,7 +970,7 @@
     <w:pPr>
       <w:keepNext/>
       <w:keepLines/>
-      <w:spacing w:before="120" w:after="60"/>
+      <w:spacing w:before="120" w:after="60" w:line="240" w:lineRule="auto"/>
       <w:outlineLvl w:val="0"/>
     </w:pPr>
     <w:rPr>

</xml_diff>

<commit_message>
Align resume internship dates with user-confirmed LinkedIn history
</commit_message>
<xml_diff>
--- a/assets/Chaitanyachidambar_S_Kulkarni_Resume.docx
+++ b/assets/Chaitanyachidambar_S_Kulkarni_Resume.docx
@@ -397,7 +397,7 @@
       </w:r>
       <w:r>
         <w:tab/>
-        <w:t>Sep 2025 to Jul 2026</w:t>
+        <w:t>Sep 2025 to Jun 2026</w:t>
       </w:r>
     </w:p>
     <w:p>
@@ -440,7 +440,7 @@
       </w:r>
       <w:r>
         <w:tab/>
-        <w:t>Jun 2025 to Jul 2025</w:t>
+        <w:t>Jun 2025 to Aug 2025</w:t>
       </w:r>
     </w:p>
     <w:p>
@@ -471,7 +471,7 @@
       </w:r>
       <w:r>
         <w:tab/>
-        <w:t>Nov 2023 to May 2024</w:t>
+        <w:t>Aug 2023 to May 2024</w:t>
       </w:r>
     </w:p>
     <w:p>

</xml_diff>